<commit_message>
Add Z3 lab code review form and update forms for CS212
- New code review form for Lab 2 (Z3 constraint solver scheduling), with
  criteria matching the revised lab instructions and example
- Point the Code Review Procedure and Style Checklist links in all forms
  to the CS212 site
- Change the course number in all form footers to CS212

Co-Authored-By: Claude Opus 5.5 <noreply@anthropic.com>
</commit_message>
<xml_diff>
--- a/docs/Labs/CS212_CodeReviewForm-Generic.docx
+++ b/docs/Labs/CS212_CodeReviewForm-Generic.docx
@@ -1788,10 +1788,10 @@
       <w:t>W</w:t>
     </w:r>
     <w:r>
-      <w:t>ritten by Brian Bird, for CS295</w:t>
+      <w:t>ritten by Brian Bird, for CS212</w:t>
     </w:r>
     <w:r>
-      <w:t xml:space="preserve">N, Lane Community College, </w:t>
+      <w:t xml:space="preserve">, Lane Community College, </w:t>
     </w:r>
     <w:r>
       <w:t>fall</w:t>

</xml_diff>